<commit_message>
Manual: packages are in dist/; packages rebuilt with the corrected manual
Co-Authored-By: Claude Opus 5.5 <noreply@anthropic.com>
Claude-Session: https://claude.ai/code/session_01Cgyjbcc33gRBzmUcJjF3Ay
</commit_message>
<xml_diff>
--- a/doc/Regina-OO-Manual.docx
+++ b/doc/Regina-OO-Manual.docx
@@ -268,7 +268,7 @@
             </w:rPr>
             <w:fldChar w:fldCharType="separate"/>
           </w:r>
-          <w:hyperlink w:anchor="__RefHeading___Toc3437_1507007106">
+          <w:hyperlink w:anchor="__RefHeading___Toc3437_2595444312">
             <w:r>
               <w:rPr>
                 <w:rStyle w:val="IndexLink"/>
@@ -288,7 +288,7 @@
             </w:tabs>
             <w:rPr/>
           </w:pPr>
-          <w:hyperlink w:anchor="__RefHeading___Toc3439_1507007106">
+          <w:hyperlink w:anchor="__RefHeading___Toc3439_2595444312">
             <w:r>
               <w:rPr>
                 <w:rStyle w:val="IndexLink"/>
@@ -308,7 +308,7 @@
             </w:tabs>
             <w:rPr/>
           </w:pPr>
-          <w:hyperlink w:anchor="__RefHeading___Toc3441_1507007106">
+          <w:hyperlink w:anchor="__RefHeading___Toc3441_2595444312">
             <w:r>
               <w:rPr>
                 <w:rStyle w:val="IndexLink"/>
@@ -328,7 +328,7 @@
             </w:tabs>
             <w:rPr/>
           </w:pPr>
-          <w:hyperlink w:anchor="__RefHeading___Toc3443_1507007106">
+          <w:hyperlink w:anchor="__RefHeading___Toc3443_2595444312">
             <w:r>
               <w:rPr>
                 <w:rStyle w:val="IndexLink"/>
@@ -348,7 +348,7 @@
             </w:tabs>
             <w:rPr/>
           </w:pPr>
-          <w:hyperlink w:anchor="__RefHeading___Toc3445_1507007106">
+          <w:hyperlink w:anchor="__RefHeading___Toc3445_2595444312">
             <w:r>
               <w:rPr>
                 <w:rStyle w:val="IndexLink"/>
@@ -368,7 +368,7 @@
             </w:tabs>
             <w:rPr/>
           </w:pPr>
-          <w:hyperlink w:anchor="__RefHeading___Toc3447_1507007106">
+          <w:hyperlink w:anchor="__RefHeading___Toc3447_2595444312">
             <w:r>
               <w:rPr>
                 <w:rStyle w:val="IndexLink"/>
@@ -388,7 +388,7 @@
             </w:tabs>
             <w:rPr/>
           </w:pPr>
-          <w:hyperlink w:anchor="__RefHeading___Toc3449_1507007106">
+          <w:hyperlink w:anchor="__RefHeading___Toc3449_2595444312">
             <w:r>
               <w:rPr>
                 <w:rStyle w:val="IndexLink"/>
@@ -408,7 +408,7 @@
             </w:tabs>
             <w:rPr/>
           </w:pPr>
-          <w:hyperlink w:anchor="__RefHeading___Toc3451_1507007106">
+          <w:hyperlink w:anchor="__RefHeading___Toc3451_2595444312">
             <w:r>
               <w:rPr>
                 <w:rStyle w:val="IndexLink"/>
@@ -428,7 +428,7 @@
             </w:tabs>
             <w:rPr/>
           </w:pPr>
-          <w:hyperlink w:anchor="__RefHeading___Toc3453_1507007106">
+          <w:hyperlink w:anchor="__RefHeading___Toc3453_2595444312">
             <w:r>
               <w:rPr>
                 <w:rStyle w:val="IndexLink"/>
@@ -448,7 +448,7 @@
             </w:tabs>
             <w:rPr/>
           </w:pPr>
-          <w:hyperlink w:anchor="__RefHeading___Toc3455_1507007106">
+          <w:hyperlink w:anchor="__RefHeading___Toc3455_2595444312">
             <w:r>
               <w:rPr>
                 <w:rStyle w:val="IndexLink"/>
@@ -468,7 +468,7 @@
             </w:tabs>
             <w:rPr/>
           </w:pPr>
-          <w:hyperlink w:anchor="__RefHeading___Toc3457_1507007106">
+          <w:hyperlink w:anchor="__RefHeading___Toc3457_2595444312">
             <w:r>
               <w:rPr>
                 <w:rStyle w:val="IndexLink"/>
@@ -488,7 +488,7 @@
             </w:tabs>
             <w:rPr/>
           </w:pPr>
-          <w:hyperlink w:anchor="__RefHeading___Toc3459_1507007106">
+          <w:hyperlink w:anchor="__RefHeading___Toc3459_2595444312">
             <w:r>
               <w:rPr>
                 <w:rStyle w:val="IndexLink"/>
@@ -508,7 +508,7 @@
             </w:tabs>
             <w:rPr/>
           </w:pPr>
-          <w:hyperlink w:anchor="__RefHeading___Toc3461_1507007106">
+          <w:hyperlink w:anchor="__RefHeading___Toc3461_2595444312">
             <w:r>
               <w:rPr>
                 <w:rStyle w:val="IndexLink"/>
@@ -528,7 +528,7 @@
             </w:tabs>
             <w:rPr/>
           </w:pPr>
-          <w:hyperlink w:anchor="__RefHeading___Toc3463_1507007106">
+          <w:hyperlink w:anchor="__RefHeading___Toc3463_2595444312">
             <w:r>
               <w:rPr>
                 <w:rStyle w:val="IndexLink"/>
@@ -548,7 +548,7 @@
             </w:tabs>
             <w:rPr/>
           </w:pPr>
-          <w:hyperlink w:anchor="__RefHeading___Toc3465_1507007106">
+          <w:hyperlink w:anchor="__RefHeading___Toc3465_2595444312">
             <w:r>
               <w:rPr>
                 <w:rStyle w:val="IndexLink"/>
@@ -568,7 +568,7 @@
             </w:tabs>
             <w:rPr/>
           </w:pPr>
-          <w:hyperlink w:anchor="__RefHeading___Toc3467_1507007106">
+          <w:hyperlink w:anchor="__RefHeading___Toc3467_2595444312">
             <w:r>
               <w:rPr>
                 <w:rStyle w:val="IndexLink"/>
@@ -588,7 +588,7 @@
             </w:tabs>
             <w:rPr/>
           </w:pPr>
-          <w:hyperlink w:anchor="__RefHeading___Toc3469_1507007106">
+          <w:hyperlink w:anchor="__RefHeading___Toc3469_2595444312">
             <w:r>
               <w:rPr>
                 <w:rStyle w:val="IndexLink"/>
@@ -608,7 +608,7 @@
             </w:tabs>
             <w:rPr/>
           </w:pPr>
-          <w:hyperlink w:anchor="__RefHeading___Toc3471_1507007106">
+          <w:hyperlink w:anchor="__RefHeading___Toc3471_2595444312">
             <w:r>
               <w:rPr>
                 <w:rStyle w:val="IndexLink"/>
@@ -628,7 +628,7 @@
             </w:tabs>
             <w:rPr/>
           </w:pPr>
-          <w:hyperlink w:anchor="__RefHeading___Toc3473_1507007106">
+          <w:hyperlink w:anchor="__RefHeading___Toc3473_2595444312">
             <w:r>
               <w:rPr>
                 <w:rStyle w:val="IndexLink"/>
@@ -648,7 +648,7 @@
             </w:tabs>
             <w:rPr/>
           </w:pPr>
-          <w:hyperlink w:anchor="__RefHeading___Toc3475_1507007106">
+          <w:hyperlink w:anchor="__RefHeading___Toc3475_2595444312">
             <w:r>
               <w:rPr>
                 <w:rStyle w:val="IndexLink"/>
@@ -668,7 +668,7 @@
             </w:tabs>
             <w:rPr/>
           </w:pPr>
-          <w:hyperlink w:anchor="__RefHeading___Toc3477_1507007106">
+          <w:hyperlink w:anchor="__RefHeading___Toc3477_2595444312">
             <w:r>
               <w:rPr>
                 <w:rStyle w:val="IndexLink"/>
@@ -688,7 +688,7 @@
             </w:tabs>
             <w:rPr/>
           </w:pPr>
-          <w:hyperlink w:anchor="__RefHeading___Toc3479_1507007106">
+          <w:hyperlink w:anchor="__RefHeading___Toc3479_2595444312">
             <w:r>
               <w:rPr>
                 <w:rStyle w:val="IndexLink"/>
@@ -708,7 +708,7 @@
             </w:tabs>
             <w:rPr/>
           </w:pPr>
-          <w:hyperlink w:anchor="__RefHeading___Toc3481_1507007106">
+          <w:hyperlink w:anchor="__RefHeading___Toc3481_2595444312">
             <w:r>
               <w:rPr>
                 <w:rStyle w:val="IndexLink"/>
@@ -728,7 +728,7 @@
             </w:tabs>
             <w:rPr/>
           </w:pPr>
-          <w:hyperlink w:anchor="__RefHeading___Toc3483_1507007106">
+          <w:hyperlink w:anchor="__RefHeading___Toc3483_2595444312">
             <w:r>
               <w:rPr>
                 <w:rStyle w:val="IndexLink"/>
@@ -748,7 +748,7 @@
             </w:tabs>
             <w:rPr/>
           </w:pPr>
-          <w:hyperlink w:anchor="__RefHeading___Toc3485_1507007106">
+          <w:hyperlink w:anchor="__RefHeading___Toc3485_2595444312">
             <w:r>
               <w:rPr>
                 <w:rStyle w:val="IndexLink"/>
@@ -768,7 +768,7 @@
             </w:tabs>
             <w:rPr/>
           </w:pPr>
-          <w:hyperlink w:anchor="__RefHeading___Toc3487_1507007106">
+          <w:hyperlink w:anchor="__RefHeading___Toc3487_2595444312">
             <w:r>
               <w:rPr>
                 <w:rStyle w:val="IndexLink"/>
@@ -788,7 +788,7 @@
             </w:tabs>
             <w:rPr/>
           </w:pPr>
-          <w:hyperlink w:anchor="__RefHeading___Toc3489_1507007106">
+          <w:hyperlink w:anchor="__RefHeading___Toc3489_2595444312">
             <w:r>
               <w:rPr>
                 <w:rStyle w:val="IndexLink"/>
@@ -808,7 +808,7 @@
             </w:tabs>
             <w:rPr/>
           </w:pPr>
-          <w:hyperlink w:anchor="__RefHeading___Toc3491_1507007106">
+          <w:hyperlink w:anchor="__RefHeading___Toc3491_2595444312">
             <w:r>
               <w:rPr>
                 <w:rStyle w:val="IndexLink"/>
@@ -828,7 +828,7 @@
             </w:tabs>
             <w:rPr/>
           </w:pPr>
-          <w:hyperlink w:anchor="__RefHeading___Toc3493_1507007106">
+          <w:hyperlink w:anchor="__RefHeading___Toc3493_2595444312">
             <w:r>
               <w:rPr>
                 <w:rStyle w:val="IndexLink"/>
@@ -848,7 +848,7 @@
             </w:tabs>
             <w:rPr/>
           </w:pPr>
-          <w:hyperlink w:anchor="__RefHeading___Toc3495_1507007106">
+          <w:hyperlink w:anchor="__RefHeading___Toc3495_2595444312">
             <w:r>
               <w:rPr>
                 <w:rStyle w:val="IndexLink"/>
@@ -868,7 +868,7 @@
             </w:tabs>
             <w:rPr/>
           </w:pPr>
-          <w:hyperlink w:anchor="__RefHeading___Toc3497_1507007106">
+          <w:hyperlink w:anchor="__RefHeading___Toc3497_2595444312">
             <w:r>
               <w:rPr>
                 <w:rStyle w:val="IndexLink"/>
@@ -888,7 +888,7 @@
             </w:tabs>
             <w:rPr/>
           </w:pPr>
-          <w:hyperlink w:anchor="__RefHeading___Toc3499_1507007106">
+          <w:hyperlink w:anchor="__RefHeading___Toc3499_2595444312">
             <w:r>
               <w:rPr>
                 <w:rStyle w:val="IndexLink"/>
@@ -908,7 +908,7 @@
             </w:tabs>
             <w:rPr/>
           </w:pPr>
-          <w:hyperlink w:anchor="__RefHeading___Toc3501_1507007106">
+          <w:hyperlink w:anchor="__RefHeading___Toc3501_2595444312">
             <w:r>
               <w:rPr>
                 <w:rStyle w:val="IndexLink"/>
@@ -928,7 +928,7 @@
             </w:tabs>
             <w:rPr/>
           </w:pPr>
-          <w:hyperlink w:anchor="__RefHeading___Toc3503_1507007106">
+          <w:hyperlink w:anchor="__RefHeading___Toc3503_2595444312">
             <w:r>
               <w:rPr>
                 <w:rStyle w:val="IndexLink"/>
@@ -948,7 +948,7 @@
             </w:tabs>
             <w:rPr/>
           </w:pPr>
-          <w:hyperlink w:anchor="__RefHeading___Toc3505_1507007106">
+          <w:hyperlink w:anchor="__RefHeading___Toc3505_2595444312">
             <w:r>
               <w:rPr>
                 <w:rStyle w:val="IndexLink"/>
@@ -968,7 +968,7 @@
             </w:tabs>
             <w:rPr/>
           </w:pPr>
-          <w:hyperlink w:anchor="__RefHeading___Toc3507_1507007106">
+          <w:hyperlink w:anchor="__RefHeading___Toc3507_2595444312">
             <w:r>
               <w:rPr>
                 <w:rStyle w:val="IndexLink"/>
@@ -988,7 +988,7 @@
             </w:tabs>
             <w:rPr/>
           </w:pPr>
-          <w:hyperlink w:anchor="__RefHeading___Toc3509_1507007106">
+          <w:hyperlink w:anchor="__RefHeading___Toc3509_2595444312">
             <w:r>
               <w:rPr>
                 <w:rStyle w:val="IndexLink"/>
@@ -1008,7 +1008,7 @@
             </w:tabs>
             <w:rPr/>
           </w:pPr>
-          <w:hyperlink w:anchor="__RefHeading___Toc3511_1507007106">
+          <w:hyperlink w:anchor="__RefHeading___Toc3511_2595444312">
             <w:r>
               <w:rPr>
                 <w:rStyle w:val="IndexLink"/>
@@ -1028,7 +1028,7 @@
             </w:tabs>
             <w:rPr/>
           </w:pPr>
-          <w:hyperlink w:anchor="__RefHeading___Toc3513_1507007106">
+          <w:hyperlink w:anchor="__RefHeading___Toc3513_2595444312">
             <w:r>
               <w:rPr>
                 <w:rStyle w:val="IndexLink"/>
@@ -1048,7 +1048,7 @@
             </w:tabs>
             <w:rPr/>
           </w:pPr>
-          <w:hyperlink w:anchor="__RefHeading___Toc3515_1507007106">
+          <w:hyperlink w:anchor="__RefHeading___Toc3515_2595444312">
             <w:r>
               <w:rPr>
                 <w:rStyle w:val="IndexLink"/>
@@ -1068,7 +1068,7 @@
             </w:tabs>
             <w:rPr/>
           </w:pPr>
-          <w:hyperlink w:anchor="__RefHeading___Toc3517_1507007106">
+          <w:hyperlink w:anchor="__RefHeading___Toc3517_2595444312">
             <w:r>
               <w:rPr>
                 <w:rStyle w:val="IndexLink"/>
@@ -1088,7 +1088,7 @@
             </w:tabs>
             <w:rPr/>
           </w:pPr>
-          <w:hyperlink w:anchor="__RefHeading___Toc3519_1507007106">
+          <w:hyperlink w:anchor="__RefHeading___Toc3519_2595444312">
             <w:r>
               <w:rPr>
                 <w:rStyle w:val="IndexLink"/>
@@ -1108,7 +1108,7 @@
             </w:tabs>
             <w:rPr/>
           </w:pPr>
-          <w:hyperlink w:anchor="__RefHeading___Toc3521_1507007106">
+          <w:hyperlink w:anchor="__RefHeading___Toc3521_2595444312">
             <w:r>
               <w:rPr>
                 <w:rStyle w:val="IndexLink"/>
@@ -1128,7 +1128,7 @@
             </w:tabs>
             <w:rPr/>
           </w:pPr>
-          <w:hyperlink w:anchor="__RefHeading___Toc3523_1507007106">
+          <w:hyperlink w:anchor="__RefHeading___Toc3523_2595444312">
             <w:r>
               <w:rPr>
                 <w:rStyle w:val="IndexLink"/>
@@ -1148,7 +1148,7 @@
             </w:tabs>
             <w:rPr/>
           </w:pPr>
-          <w:hyperlink w:anchor="__RefHeading___Toc3525_1507007106">
+          <w:hyperlink w:anchor="__RefHeading___Toc3525_2595444312">
             <w:r>
               <w:rPr>
                 <w:rStyle w:val="IndexLink"/>
@@ -1168,7 +1168,7 @@
             </w:tabs>
             <w:rPr/>
           </w:pPr>
-          <w:hyperlink w:anchor="__RefHeading___Toc3527_1507007106">
+          <w:hyperlink w:anchor="__RefHeading___Toc3527_2595444312">
             <w:r>
               <w:rPr>
                 <w:rStyle w:val="IndexLink"/>
@@ -1188,7 +1188,7 @@
             </w:tabs>
             <w:rPr/>
           </w:pPr>
-          <w:hyperlink w:anchor="__RefHeading___Toc3529_1507007106">
+          <w:hyperlink w:anchor="__RefHeading___Toc3529_2595444312">
             <w:r>
               <w:rPr>
                 <w:rStyle w:val="IndexLink"/>
@@ -1208,7 +1208,7 @@
             </w:tabs>
             <w:rPr/>
           </w:pPr>
-          <w:hyperlink w:anchor="__RefHeading___Toc3531_1507007106">
+          <w:hyperlink w:anchor="__RefHeading___Toc3531_2595444312">
             <w:r>
               <w:rPr>
                 <w:rStyle w:val="IndexLink"/>
@@ -1228,7 +1228,7 @@
             </w:tabs>
             <w:rPr/>
           </w:pPr>
-          <w:hyperlink w:anchor="__RefHeading___Toc3533_1507007106">
+          <w:hyperlink w:anchor="__RefHeading___Toc3533_2595444312">
             <w:r>
               <w:rPr>
                 <w:rStyle w:val="IndexLink"/>
@@ -1248,7 +1248,7 @@
             </w:tabs>
             <w:rPr/>
           </w:pPr>
-          <w:hyperlink w:anchor="__RefHeading___Toc3535_1507007106">
+          <w:hyperlink w:anchor="__RefHeading___Toc3535_2595444312">
             <w:r>
               <w:rPr>
                 <w:rStyle w:val="IndexLink"/>
@@ -1268,7 +1268,7 @@
             </w:tabs>
             <w:rPr/>
           </w:pPr>
-          <w:hyperlink w:anchor="__RefHeading___Toc3537_1507007106">
+          <w:hyperlink w:anchor="__RefHeading___Toc3537_2595444312">
             <w:r>
               <w:rPr>
                 <w:rStyle w:val="IndexLink"/>
@@ -1288,7 +1288,7 @@
             </w:tabs>
             <w:rPr/>
           </w:pPr>
-          <w:hyperlink w:anchor="__RefHeading___Toc3539_1507007106">
+          <w:hyperlink w:anchor="__RefHeading___Toc3539_2595444312">
             <w:r>
               <w:rPr>
                 <w:rStyle w:val="IndexLink"/>
@@ -1308,7 +1308,7 @@
             </w:tabs>
             <w:rPr/>
           </w:pPr>
-          <w:hyperlink w:anchor="__RefHeading___Toc3541_1507007106">
+          <w:hyperlink w:anchor="__RefHeading___Toc3541_2595444312">
             <w:r>
               <w:rPr>
                 <w:rStyle w:val="IndexLink"/>
@@ -1328,7 +1328,7 @@
             </w:tabs>
             <w:rPr/>
           </w:pPr>
-          <w:hyperlink w:anchor="__RefHeading___Toc3543_1507007106">
+          <w:hyperlink w:anchor="__RefHeading___Toc3543_2595444312">
             <w:r>
               <w:rPr>
                 <w:rStyle w:val="IndexLink"/>
@@ -1348,7 +1348,7 @@
             </w:tabs>
             <w:rPr/>
           </w:pPr>
-          <w:hyperlink w:anchor="__RefHeading___Toc3545_1507007106">
+          <w:hyperlink w:anchor="__RefHeading___Toc3545_2595444312">
             <w:r>
               <w:rPr>
                 <w:rStyle w:val="IndexLink"/>
@@ -1368,7 +1368,7 @@
             </w:tabs>
             <w:rPr/>
           </w:pPr>
-          <w:hyperlink w:anchor="__RefHeading___Toc3547_1507007106">
+          <w:hyperlink w:anchor="__RefHeading___Toc3547_2595444312">
             <w:r>
               <w:rPr>
                 <w:rStyle w:val="IndexLink"/>
@@ -1388,7 +1388,7 @@
             </w:tabs>
             <w:rPr/>
           </w:pPr>
-          <w:hyperlink w:anchor="__RefHeading___Toc3549_1507007106">
+          <w:hyperlink w:anchor="__RefHeading___Toc3549_2595444312">
             <w:r>
               <w:rPr>
                 <w:rStyle w:val="IndexLink"/>
@@ -1408,7 +1408,7 @@
             </w:tabs>
             <w:rPr/>
           </w:pPr>
-          <w:hyperlink w:anchor="__RefHeading___Toc3551_1507007106">
+          <w:hyperlink w:anchor="__RefHeading___Toc3551_2595444312">
             <w:r>
               <w:rPr>
                 <w:rStyle w:val="IndexLink"/>
@@ -1428,7 +1428,7 @@
             </w:tabs>
             <w:rPr/>
           </w:pPr>
-          <w:hyperlink w:anchor="__RefHeading___Toc3553_1507007106">
+          <w:hyperlink w:anchor="__RefHeading___Toc3553_2595444312">
             <w:r>
               <w:rPr>
                 <w:rStyle w:val="IndexLink"/>
@@ -1448,7 +1448,7 @@
             </w:tabs>
             <w:rPr/>
           </w:pPr>
-          <w:hyperlink w:anchor="__RefHeading___Toc3555_1507007106">
+          <w:hyperlink w:anchor="__RefHeading___Toc3555_2595444312">
             <w:r>
               <w:rPr>
                 <w:rStyle w:val="IndexLink"/>
@@ -1468,7 +1468,7 @@
             </w:tabs>
             <w:rPr/>
           </w:pPr>
-          <w:hyperlink w:anchor="__RefHeading___Toc3557_1507007106">
+          <w:hyperlink w:anchor="__RefHeading___Toc3557_2595444312">
             <w:r>
               <w:rPr>
                 <w:rStyle w:val="IndexLink"/>
@@ -1510,7 +1510,7 @@
         <w:pStyle w:val="Heading1"/>
         <w:rPr/>
       </w:pPr>
-      <w:bookmarkStart w:id="0" w:name="__RefHeading___Toc3437_1507007106"/>
+      <w:bookmarkStart w:id="0" w:name="__RefHeading___Toc3437_2595444312"/>
       <w:bookmarkEnd w:id="0"/>
       <w:r>
         <w:rPr/>
@@ -2165,7 +2165,7 @@
         <w:pStyle w:val="Heading1"/>
         <w:rPr/>
       </w:pPr>
-      <w:bookmarkStart w:id="1" w:name="__RefHeading___Toc3439_1507007106"/>
+      <w:bookmarkStart w:id="1" w:name="__RefHeading___Toc3439_2595444312"/>
       <w:bookmarkEnd w:id="1"/>
       <w:r>
         <w:rPr/>
@@ -2572,7 +2572,7 @@
         <w:pStyle w:val="Heading2"/>
         <w:rPr/>
       </w:pPr>
-      <w:bookmarkStart w:id="2" w:name="__RefHeading___Toc3441_1507007106"/>
+      <w:bookmarkStart w:id="2" w:name="__RefHeading___Toc3441_2595444312"/>
       <w:bookmarkEnd w:id="2"/>
       <w:r>
         <w:rPr/>
@@ -2665,7 +2665,7 @@
         <w:pStyle w:val="Heading2"/>
         <w:rPr/>
       </w:pPr>
-      <w:bookmarkStart w:id="3" w:name="__RefHeading___Toc3443_1507007106"/>
+      <w:bookmarkStart w:id="3" w:name="__RefHeading___Toc3443_2595444312"/>
       <w:bookmarkEnd w:id="3"/>
       <w:r>
         <w:rPr/>
@@ -3653,7 +3653,7 @@
         <w:pStyle w:val="Heading2"/>
         <w:rPr/>
       </w:pPr>
-      <w:bookmarkStart w:id="4" w:name="__RefHeading___Toc3445_1507007106"/>
+      <w:bookmarkStart w:id="4" w:name="__RefHeading___Toc3445_2595444312"/>
       <w:bookmarkEnd w:id="4"/>
       <w:r>
         <w:rPr/>
@@ -4156,7 +4156,7 @@
         <w:pStyle w:val="Heading1"/>
         <w:rPr/>
       </w:pPr>
-      <w:bookmarkStart w:id="5" w:name="__RefHeading___Toc3447_1507007106"/>
+      <w:bookmarkStart w:id="5" w:name="__RefHeading___Toc3447_2595444312"/>
       <w:bookmarkEnd w:id="5"/>
       <w:r>
         <w:rPr/>
@@ -4168,7 +4168,7 @@
         <w:pStyle w:val="Heading2"/>
         <w:rPr/>
       </w:pPr>
-      <w:bookmarkStart w:id="6" w:name="__RefHeading___Toc3449_1507007106"/>
+      <w:bookmarkStart w:id="6" w:name="__RefHeading___Toc3449_2595444312"/>
       <w:bookmarkEnd w:id="6"/>
       <w:r>
         <w:rPr/>
@@ -4733,7 +4733,7 @@
       </w:pPr>
       <w:r>
         <w:rPr/>
-        <w:t xml:space="preserve">The packages are attached to the release on the project's GitHub page and are also kept in the </w:t>
+        <w:t xml:space="preserve">The packages are in the </w:t>
       </w:r>
       <w:r>
         <w:rPr>
@@ -4745,7 +4745,7 @@
       </w:r>
       <w:r>
         <w:rPr/>
-        <w:t xml:space="preserve"> folder of the repository.</w:t>
+        <w:t xml:space="preserve"> folder of the repository, github.com/mikebeer/REGINA2, together with a file of SHA-256 checksums.</w:t>
       </w:r>
     </w:p>
     <w:p>
@@ -4753,7 +4753,7 @@
         <w:pStyle w:val="Heading2"/>
         <w:rPr/>
       </w:pPr>
-      <w:bookmarkStart w:id="7" w:name="__RefHeading___Toc3451_1507007106"/>
+      <w:bookmarkStart w:id="7" w:name="__RefHeading___Toc3451_2595444312"/>
       <w:bookmarkEnd w:id="7"/>
       <w:r>
         <w:rPr/>
@@ -4949,7 +4949,7 @@
         <w:pStyle w:val="Heading2"/>
         <w:rPr/>
       </w:pPr>
-      <w:bookmarkStart w:id="8" w:name="__RefHeading___Toc3453_1507007106"/>
+      <w:bookmarkStart w:id="8" w:name="__RefHeading___Toc3453_2595444312"/>
       <w:bookmarkEnd w:id="8"/>
       <w:r>
         <w:rPr/>
@@ -5109,7 +5109,7 @@
         <w:pStyle w:val="Heading2"/>
         <w:rPr/>
       </w:pPr>
-      <w:bookmarkStart w:id="9" w:name="__RefHeading___Toc3455_1507007106"/>
+      <w:bookmarkStart w:id="9" w:name="__RefHeading___Toc3455_2595444312"/>
       <w:bookmarkEnd w:id="9"/>
       <w:r>
         <w:rPr/>
@@ -5386,7 +5386,7 @@
         <w:pStyle w:val="Heading2"/>
         <w:rPr/>
       </w:pPr>
-      <w:bookmarkStart w:id="10" w:name="__RefHeading___Toc3457_1507007106"/>
+      <w:bookmarkStart w:id="10" w:name="__RefHeading___Toc3457_2595444312"/>
       <w:bookmarkEnd w:id="10"/>
       <w:r>
         <w:rPr/>
@@ -5768,7 +5768,7 @@
         <w:pStyle w:val="Heading2"/>
         <w:rPr/>
       </w:pPr>
-      <w:bookmarkStart w:id="11" w:name="__RefHeading___Toc3459_1507007106"/>
+      <w:bookmarkStart w:id="11" w:name="__RefHeading___Toc3459_2595444312"/>
       <w:bookmarkEnd w:id="11"/>
       <w:r>
         <w:rPr/>
@@ -6567,7 +6567,7 @@
         <w:pStyle w:val="Heading1"/>
         <w:rPr/>
       </w:pPr>
-      <w:bookmarkStart w:id="12" w:name="__RefHeading___Toc3461_1507007106"/>
+      <w:bookmarkStart w:id="12" w:name="__RefHeading___Toc3461_2595444312"/>
       <w:bookmarkEnd w:id="12"/>
       <w:r>
         <w:rPr/>
@@ -6579,7 +6579,7 @@
         <w:pStyle w:val="Heading2"/>
         <w:rPr/>
       </w:pPr>
-      <w:bookmarkStart w:id="13" w:name="__RefHeading___Toc3463_1507007106"/>
+      <w:bookmarkStart w:id="13" w:name="__RefHeading___Toc3463_2595444312"/>
       <w:bookmarkEnd w:id="13"/>
       <w:r>
         <w:rPr/>
@@ -7209,7 +7209,7 @@
         <w:pStyle w:val="Heading2"/>
         <w:rPr/>
       </w:pPr>
-      <w:bookmarkStart w:id="14" w:name="__RefHeading___Toc3465_1507007106"/>
+      <w:bookmarkStart w:id="14" w:name="__RefHeading___Toc3465_2595444312"/>
       <w:bookmarkEnd w:id="14"/>
       <w:r>
         <w:rPr/>
@@ -8015,7 +8015,7 @@
         <w:pStyle w:val="Heading2"/>
         <w:rPr/>
       </w:pPr>
-      <w:bookmarkStart w:id="15" w:name="__RefHeading___Toc3467_1507007106"/>
+      <w:bookmarkStart w:id="15" w:name="__RefHeading___Toc3467_2595444312"/>
       <w:bookmarkEnd w:id="15"/>
       <w:r>
         <w:rPr/>
@@ -8163,7 +8163,7 @@
         <w:pStyle w:val="Heading1"/>
         <w:rPr/>
       </w:pPr>
-      <w:bookmarkStart w:id="16" w:name="__RefHeading___Toc3469_1507007106"/>
+      <w:bookmarkStart w:id="16" w:name="__RefHeading___Toc3469_2595444312"/>
       <w:bookmarkEnd w:id="16"/>
       <w:r>
         <w:rPr/>
@@ -8198,7 +8198,7 @@
         <w:pStyle w:val="Heading2"/>
         <w:rPr/>
       </w:pPr>
-      <w:bookmarkStart w:id="17" w:name="__RefHeading___Toc3471_1507007106"/>
+      <w:bookmarkStart w:id="17" w:name="__RefHeading___Toc3471_2595444312"/>
       <w:bookmarkEnd w:id="17"/>
       <w:r>
         <w:rPr/>
@@ -8940,7 +8940,7 @@
         <w:pStyle w:val="Heading2"/>
         <w:rPr/>
       </w:pPr>
-      <w:bookmarkStart w:id="18" w:name="__RefHeading___Toc3473_1507007106"/>
+      <w:bookmarkStart w:id="18" w:name="__RefHeading___Toc3473_2595444312"/>
       <w:bookmarkEnd w:id="18"/>
       <w:r>
         <w:rPr/>
@@ -9707,7 +9707,7 @@
         <w:pStyle w:val="Heading2"/>
         <w:rPr/>
       </w:pPr>
-      <w:bookmarkStart w:id="19" w:name="__RefHeading___Toc3475_1507007106"/>
+      <w:bookmarkStart w:id="19" w:name="__RefHeading___Toc3475_2595444312"/>
       <w:bookmarkEnd w:id="19"/>
       <w:r>
         <w:rPr/>
@@ -9867,7 +9867,7 @@
         <w:pStyle w:val="Heading2"/>
         <w:rPr/>
       </w:pPr>
-      <w:bookmarkStart w:id="20" w:name="__RefHeading___Toc3477_1507007106"/>
+      <w:bookmarkStart w:id="20" w:name="__RefHeading___Toc3477_2595444312"/>
       <w:bookmarkEnd w:id="20"/>
       <w:r>
         <w:rPr/>
@@ -10088,7 +10088,7 @@
         <w:pStyle w:val="Heading2"/>
         <w:rPr/>
       </w:pPr>
-      <w:bookmarkStart w:id="21" w:name="__RefHeading___Toc3479_1507007106"/>
+      <w:bookmarkStart w:id="21" w:name="__RefHeading___Toc3479_2595444312"/>
       <w:bookmarkEnd w:id="21"/>
       <w:r>
         <w:rPr/>
@@ -10114,7 +10114,7 @@
         <w:pStyle w:val="Heading1"/>
         <w:rPr/>
       </w:pPr>
-      <w:bookmarkStart w:id="22" w:name="__RefHeading___Toc3481_1507007106"/>
+      <w:bookmarkStart w:id="22" w:name="__RefHeading___Toc3481_2595444312"/>
       <w:bookmarkEnd w:id="22"/>
       <w:r>
         <w:rPr/>
@@ -10137,7 +10137,7 @@
         <w:pStyle w:val="Heading2"/>
         <w:rPr/>
       </w:pPr>
-      <w:bookmarkStart w:id="23" w:name="__RefHeading___Toc3483_1507007106"/>
+      <w:bookmarkStart w:id="23" w:name="__RefHeading___Toc3483_2595444312"/>
       <w:bookmarkEnd w:id="23"/>
       <w:r>
         <w:rPr/>
@@ -10424,7 +10424,7 @@
         <w:pStyle w:val="Heading2"/>
         <w:rPr/>
       </w:pPr>
-      <w:bookmarkStart w:id="24" w:name="__RefHeading___Toc3485_1507007106"/>
+      <w:bookmarkStart w:id="24" w:name="__RefHeading___Toc3485_2595444312"/>
       <w:bookmarkEnd w:id="24"/>
       <w:r>
         <w:rPr/>
@@ -10561,7 +10561,7 @@
         <w:pStyle w:val="Heading2"/>
         <w:rPr/>
       </w:pPr>
-      <w:bookmarkStart w:id="25" w:name="__RefHeading___Toc3487_1507007106"/>
+      <w:bookmarkStart w:id="25" w:name="__RefHeading___Toc3487_2595444312"/>
       <w:bookmarkEnd w:id="25"/>
       <w:r>
         <w:rPr/>
@@ -11642,7 +11642,7 @@
         <w:pStyle w:val="Heading2"/>
         <w:rPr/>
       </w:pPr>
-      <w:bookmarkStart w:id="26" w:name="__RefHeading___Toc3489_1507007106"/>
+      <w:bookmarkStart w:id="26" w:name="__RefHeading___Toc3489_2595444312"/>
       <w:bookmarkEnd w:id="26"/>
       <w:r>
         <w:rPr/>
@@ -11898,7 +11898,7 @@
         <w:pStyle w:val="Heading1"/>
         <w:rPr/>
       </w:pPr>
-      <w:bookmarkStart w:id="27" w:name="__RefHeading___Toc3491_1507007106"/>
+      <w:bookmarkStart w:id="27" w:name="__RefHeading___Toc3491_2595444312"/>
       <w:bookmarkEnd w:id="27"/>
       <w:r>
         <w:rPr/>
@@ -11910,7 +11910,7 @@
         <w:pStyle w:val="Heading2"/>
         <w:rPr/>
       </w:pPr>
-      <w:bookmarkStart w:id="28" w:name="__RefHeading___Toc3493_1507007106"/>
+      <w:bookmarkStart w:id="28" w:name="__RefHeading___Toc3493_2595444312"/>
       <w:bookmarkEnd w:id="28"/>
       <w:r>
         <w:rPr/>
@@ -12721,7 +12721,7 @@
         <w:pStyle w:val="Heading2"/>
         <w:rPr/>
       </w:pPr>
-      <w:bookmarkStart w:id="29" w:name="__RefHeading___Toc3495_1507007106"/>
+      <w:bookmarkStart w:id="29" w:name="__RefHeading___Toc3495_2595444312"/>
       <w:bookmarkEnd w:id="29"/>
       <w:r>
         <w:rPr/>
@@ -13133,7 +13133,7 @@
         <w:pStyle w:val="Heading2"/>
         <w:rPr/>
       </w:pPr>
-      <w:bookmarkStart w:id="30" w:name="__RefHeading___Toc3497_1507007106"/>
+      <w:bookmarkStart w:id="30" w:name="__RefHeading___Toc3497_2595444312"/>
       <w:bookmarkEnd w:id="30"/>
       <w:r>
         <w:rPr/>
@@ -14052,7 +14052,7 @@
         <w:pStyle w:val="Heading2"/>
         <w:rPr/>
       </w:pPr>
-      <w:bookmarkStart w:id="31" w:name="__RefHeading___Toc3499_1507007106"/>
+      <w:bookmarkStart w:id="31" w:name="__RefHeading___Toc3499_2595444312"/>
       <w:bookmarkEnd w:id="31"/>
       <w:r>
         <w:rPr/>
@@ -14931,7 +14931,7 @@
         <w:pStyle w:val="Heading2"/>
         <w:rPr/>
       </w:pPr>
-      <w:bookmarkStart w:id="32" w:name="__RefHeading___Toc3501_1507007106"/>
+      <w:bookmarkStart w:id="32" w:name="__RefHeading___Toc3501_2595444312"/>
       <w:bookmarkEnd w:id="32"/>
       <w:r>
         <w:rPr/>
@@ -15393,7 +15393,7 @@
         <w:pStyle w:val="Heading2"/>
         <w:rPr/>
       </w:pPr>
-      <w:bookmarkStart w:id="33" w:name="__RefHeading___Toc3503_1507007106"/>
+      <w:bookmarkStart w:id="33" w:name="__RefHeading___Toc3503_2595444312"/>
       <w:bookmarkEnd w:id="33"/>
       <w:r>
         <w:rPr/>
@@ -15515,7 +15515,7 @@
         <w:pStyle w:val="Heading1"/>
         <w:rPr/>
       </w:pPr>
-      <w:bookmarkStart w:id="34" w:name="__RefHeading___Toc3505_1507007106"/>
+      <w:bookmarkStart w:id="34" w:name="__RefHeading___Toc3505_2595444312"/>
       <w:bookmarkEnd w:id="34"/>
       <w:r>
         <w:rPr/>
@@ -15550,7 +15550,7 @@
         <w:pStyle w:val="Heading2"/>
         <w:rPr/>
       </w:pPr>
-      <w:bookmarkStart w:id="35" w:name="__RefHeading___Toc3507_1507007106"/>
+      <w:bookmarkStart w:id="35" w:name="__RefHeading___Toc3507_2595444312"/>
       <w:bookmarkEnd w:id="35"/>
       <w:r>
         <w:rPr/>
@@ -16407,7 +16407,7 @@
         <w:pStyle w:val="Heading2"/>
         <w:rPr/>
       </w:pPr>
-      <w:bookmarkStart w:id="36" w:name="__RefHeading___Toc3509_1507007106"/>
+      <w:bookmarkStart w:id="36" w:name="__RefHeading___Toc3509_2595444312"/>
       <w:bookmarkEnd w:id="36"/>
       <w:r>
         <w:rPr/>
@@ -17012,7 +17012,7 @@
         <w:pStyle w:val="Heading2"/>
         <w:rPr/>
       </w:pPr>
-      <w:bookmarkStart w:id="37" w:name="__RefHeading___Toc3511_1507007106"/>
+      <w:bookmarkStart w:id="37" w:name="__RefHeading___Toc3511_2595444312"/>
       <w:bookmarkEnd w:id="37"/>
       <w:r>
         <w:rPr/>
@@ -17506,7 +17506,7 @@
         <w:pStyle w:val="Heading2"/>
         <w:rPr/>
       </w:pPr>
-      <w:bookmarkStart w:id="38" w:name="__RefHeading___Toc3513_1507007106"/>
+      <w:bookmarkStart w:id="38" w:name="__RefHeading___Toc3513_2595444312"/>
       <w:bookmarkEnd w:id="38"/>
       <w:r>
         <w:rPr/>
@@ -18594,7 +18594,7 @@
         <w:pStyle w:val="Heading2"/>
         <w:rPr/>
       </w:pPr>
-      <w:bookmarkStart w:id="39" w:name="__RefHeading___Toc3515_1507007106"/>
+      <w:bookmarkStart w:id="39" w:name="__RefHeading___Toc3515_2595444312"/>
       <w:bookmarkEnd w:id="39"/>
       <w:r>
         <w:rPr/>
@@ -19240,7 +19240,7 @@
         <w:pStyle w:val="Heading2"/>
         <w:rPr/>
       </w:pPr>
-      <w:bookmarkStart w:id="40" w:name="__RefHeading___Toc3517_1507007106"/>
+      <w:bookmarkStart w:id="40" w:name="__RefHeading___Toc3517_2595444312"/>
       <w:bookmarkEnd w:id="40"/>
       <w:r>
         <w:rPr/>
@@ -19779,7 +19779,7 @@
         <w:pStyle w:val="Heading2"/>
         <w:rPr/>
       </w:pPr>
-      <w:bookmarkStart w:id="41" w:name="__RefHeading___Toc3519_1507007106"/>
+      <w:bookmarkStart w:id="41" w:name="__RefHeading___Toc3519_2595444312"/>
       <w:bookmarkEnd w:id="41"/>
       <w:r>
         <w:rPr/>
@@ -20129,7 +20129,7 @@
         <w:pStyle w:val="Heading2"/>
         <w:rPr/>
       </w:pPr>
-      <w:bookmarkStart w:id="42" w:name="__RefHeading___Toc3521_1507007106"/>
+      <w:bookmarkStart w:id="42" w:name="__RefHeading___Toc3521_2595444312"/>
       <w:bookmarkEnd w:id="42"/>
       <w:r>
         <w:rPr/>
@@ -20425,7 +20425,7 @@
         <w:pStyle w:val="Heading1"/>
         <w:rPr/>
       </w:pPr>
-      <w:bookmarkStart w:id="43" w:name="__RefHeading___Toc3523_1507007106"/>
+      <w:bookmarkStart w:id="43" w:name="__RefHeading___Toc3523_2595444312"/>
       <w:bookmarkEnd w:id="43"/>
       <w:r>
         <w:rPr/>
@@ -21075,7 +21075,7 @@
         <w:pStyle w:val="Heading2"/>
         <w:rPr/>
       </w:pPr>
-      <w:bookmarkStart w:id="44" w:name="__RefHeading___Toc3525_1507007106"/>
+      <w:bookmarkStart w:id="44" w:name="__RefHeading___Toc3525_2595444312"/>
       <w:bookmarkEnd w:id="44"/>
       <w:r>
         <w:rPr/>
@@ -22487,7 +22487,7 @@
         <w:pStyle w:val="Heading2"/>
         <w:rPr/>
       </w:pPr>
-      <w:bookmarkStart w:id="45" w:name="__RefHeading___Toc3527_1507007106"/>
+      <w:bookmarkStart w:id="45" w:name="__RefHeading___Toc3527_2595444312"/>
       <w:bookmarkEnd w:id="45"/>
       <w:r>
         <w:rPr/>
@@ -23955,7 +23955,7 @@
         <w:pStyle w:val="Heading2"/>
         <w:rPr/>
       </w:pPr>
-      <w:bookmarkStart w:id="46" w:name="__RefHeading___Toc3529_1507007106"/>
+      <w:bookmarkStart w:id="46" w:name="__RefHeading___Toc3529_2595444312"/>
       <w:bookmarkEnd w:id="46"/>
       <w:r>
         <w:rPr/>
@@ -25142,7 +25142,7 @@
         <w:pStyle w:val="Heading2"/>
         <w:rPr/>
       </w:pPr>
-      <w:bookmarkStart w:id="47" w:name="__RefHeading___Toc3531_1507007106"/>
+      <w:bookmarkStart w:id="47" w:name="__RefHeading___Toc3531_2595444312"/>
       <w:bookmarkEnd w:id="47"/>
       <w:r>
         <w:rPr/>
@@ -27108,7 +27108,7 @@
         <w:pStyle w:val="Heading2"/>
         <w:rPr/>
       </w:pPr>
-      <w:bookmarkStart w:id="48" w:name="__RefHeading___Toc3533_1507007106"/>
+      <w:bookmarkStart w:id="48" w:name="__RefHeading___Toc3533_2595444312"/>
       <w:bookmarkEnd w:id="48"/>
       <w:r>
         <w:rPr/>
@@ -28529,7 +28529,7 @@
         <w:pStyle w:val="Heading2"/>
         <w:rPr/>
       </w:pPr>
-      <w:bookmarkStart w:id="49" w:name="__RefHeading___Toc3535_1507007106"/>
+      <w:bookmarkStart w:id="49" w:name="__RefHeading___Toc3535_2595444312"/>
       <w:bookmarkEnd w:id="49"/>
       <w:r>
         <w:rPr/>
@@ -30750,7 +30750,7 @@
         <w:pStyle w:val="Heading2"/>
         <w:rPr/>
       </w:pPr>
-      <w:bookmarkStart w:id="50" w:name="__RefHeading___Toc3537_1507007106"/>
+      <w:bookmarkStart w:id="50" w:name="__RefHeading___Toc3537_2595444312"/>
       <w:bookmarkEnd w:id="50"/>
       <w:r>
         <w:rPr/>
@@ -32510,7 +32510,7 @@
         <w:pStyle w:val="Heading2"/>
         <w:rPr/>
       </w:pPr>
-      <w:bookmarkStart w:id="51" w:name="__RefHeading___Toc3539_1507007106"/>
+      <w:bookmarkStart w:id="51" w:name="__RefHeading___Toc3539_2595444312"/>
       <w:bookmarkEnd w:id="51"/>
       <w:r>
         <w:rPr/>
@@ -34987,7 +34987,7 @@
         <w:pStyle w:val="Heading1"/>
         <w:rPr/>
       </w:pPr>
-      <w:bookmarkStart w:id="52" w:name="__RefHeading___Toc3541_1507007106"/>
+      <w:bookmarkStart w:id="52" w:name="__RefHeading___Toc3541_2595444312"/>
       <w:bookmarkEnd w:id="52"/>
       <w:r>
         <w:rPr/>
@@ -34999,7 +34999,7 @@
         <w:pStyle w:val="Heading2"/>
         <w:rPr/>
       </w:pPr>
-      <w:bookmarkStart w:id="53" w:name="__RefHeading___Toc3543_1507007106"/>
+      <w:bookmarkStart w:id="53" w:name="__RefHeading___Toc3543_2595444312"/>
       <w:bookmarkEnd w:id="53"/>
       <w:r>
         <w:rPr/>
@@ -35048,7 +35048,7 @@
         <w:pStyle w:val="Heading2"/>
         <w:rPr/>
       </w:pPr>
-      <w:bookmarkStart w:id="54" w:name="__RefHeading___Toc3545_1507007106"/>
+      <w:bookmarkStart w:id="54" w:name="__RefHeading___Toc3545_2595444312"/>
       <w:bookmarkEnd w:id="54"/>
       <w:r>
         <w:rPr/>
@@ -35329,7 +35329,7 @@
         <w:pStyle w:val="Heading2"/>
         <w:rPr/>
       </w:pPr>
-      <w:bookmarkStart w:id="55" w:name="__RefHeading___Toc3547_1507007106"/>
+      <w:bookmarkStart w:id="55" w:name="__RefHeading___Toc3547_2595444312"/>
       <w:bookmarkEnd w:id="55"/>
       <w:r>
         <w:rPr/>
@@ -35398,7 +35398,7 @@
         <w:pStyle w:val="Heading2"/>
         <w:rPr/>
       </w:pPr>
-      <w:bookmarkStart w:id="56" w:name="__RefHeading___Toc3549_1507007106"/>
+      <w:bookmarkStart w:id="56" w:name="__RefHeading___Toc3549_2595444312"/>
       <w:bookmarkEnd w:id="56"/>
       <w:r>
         <w:rPr/>
@@ -35689,7 +35689,7 @@
         <w:pStyle w:val="Heading2"/>
         <w:rPr/>
       </w:pPr>
-      <w:bookmarkStart w:id="57" w:name="__RefHeading___Toc3551_1507007106"/>
+      <w:bookmarkStart w:id="57" w:name="__RefHeading___Toc3551_2595444312"/>
       <w:bookmarkEnd w:id="57"/>
       <w:r>
         <w:rPr/>
@@ -35715,7 +35715,7 @@
         <w:pStyle w:val="Heading1"/>
         <w:rPr/>
       </w:pPr>
-      <w:bookmarkStart w:id="58" w:name="__RefHeading___Toc3553_1507007106"/>
+      <w:bookmarkStart w:id="58" w:name="__RefHeading___Toc3553_2595444312"/>
       <w:bookmarkEnd w:id="58"/>
       <w:r>
         <w:rPr/>
@@ -37471,7 +37471,7 @@
         <w:pStyle w:val="Heading1"/>
         <w:rPr/>
       </w:pPr>
-      <w:bookmarkStart w:id="59" w:name="__RefHeading___Toc3555_1507007106"/>
+      <w:bookmarkStart w:id="59" w:name="__RefHeading___Toc3555_2595444312"/>
       <w:bookmarkEnd w:id="59"/>
       <w:r>
         <w:rPr/>
@@ -38102,7 +38102,7 @@
         <w:pStyle w:val="Heading1"/>
         <w:rPr/>
       </w:pPr>
-      <w:bookmarkStart w:id="60" w:name="__RefHeading___Toc3557_1507007106"/>
+      <w:bookmarkStart w:id="60" w:name="__RefHeading___Toc3557_2595444312"/>
       <w:bookmarkEnd w:id="60"/>
       <w:r>
         <w:rPr/>

</xml_diff>